<commit_message>
court(wva): petition-for-discretionary-review gated, docx reported (fb-595.54.21)
Re-rendered on master's model: note 2 after the section-sign citation is set in
LaTeX again (296/296 lines, 14 pages). Word's table pages the Hudkins link that
runs over a page end where it ends (B4); cross_engine_docx: report (fb-595.54.21).

Co-Authored-By: Claude Opus 5.5 <noreply@anthropic.com>
</commit_message>
<xml_diff>
--- a/courts/fourth-circuit/west-virginia/state/supreme-court/petition-for-discretionary-review/usage/OUTPUT-petition-for-discretionary-review.docx
+++ b/courts/fourth-circuit/west-virginia/state/supreme-court/petition-for-discretionary-review/usage/OUTPUT-petition-for-discretionary-review.docx
@@ -5219,7 +5219,19 @@
         <w:t xml:space="preserve"> </w:t>
       </w:r>
       <w:r>
-        <w:t xml:space="preserve">West Virginia Code § 11-⁠⁠10A-⁠⁠19(e) was added as part of the creation of the Office of Tax Appeals and provides provisions for appeal similar to those previously provided for appealing decisions of the Commissioner (in Section 11-⁠10-⁠10(d)) but with the addition of the opportunity to make application to the circuit court for certification that the assets of the taxpayer are adequate to secure performance. See H.D.</w:t>
+        <w:t xml:space="preserve">West Virginia Code § 11-⁠10A-⁠19(e) was added as part of the creation of the Office of Tax Appeals and provides provisions for appeal similar to those previously provided for appealing decisions of the Commissioner (in Section 11</w:t>
+      </w:r>
+      <w:r>
+        <w:noBreakHyphen/>
+      </w:r>
+      <w:r>
+        <w:t xml:space="preserve">10</w:t>
+      </w:r>
+      <w:r>
+        <w:noBreakHyphen/>
+      </w:r>
+      <w:r>
+        <w:t xml:space="preserve">10(d)) but with the addition of the opportunity to make application to the circuit court for certification that the assets of the taxpayer are adequate to secure performance. See H.D.</w:t>
       </w:r>
       <w:r>
         <w:t xml:space="preserve"> </w:t>

</xml_diff>